<commit_message>
docs(as-built): regenerate rendered + docx mirrors after step-list reformat
Rebuilds the GitHub-mobile rendered/ markdown and docx/ exports for the
16 guides whose "Who does what" blocks were reformatted into step lists.
Text-only change; diagram PNGs unchanged.

Co-Authored-By: Claude Opus 4.8 <noreply@anthropic.com>
Claude-Session: https://claude.ai/code/session_01RwtMRFwzHC7G5CTnGLhgKu
</commit_message>
<xml_diff>
--- a/docs/as-built/docx/_TEMPLATE.docx
+++ b/docs/as-built/docx/_TEMPLATE.docx
@@ -563,11 +563,17 @@
         <w:t xml:space="preserve"> </w:t>
       </w:r>
       <w:r>
-        <w:t xml:space="preserve">1)</w:t>
-      </w:r>
-      <w:r>
-        <w:t xml:space="preserve"> </w:t>
-      </w:r>
+        <w:t xml:space="preserve">(one step per line — a numbered list, not a run-on sentence)</w:t>
+      </w:r>
+    </w:p>
+    <w:p>
+      <w:pPr>
+        <w:numPr>
+          <w:ilvl w:val="0"/>
+          <w:numId w:val="1003"/>
+        </w:numPr>
+        <w:pStyle w:val="Compact"/>
+      </w:pPr>
       <w:r>
         <w:rPr>
           <w:rStyle w:val="VerbatimChar"/>
@@ -602,7 +608,19 @@
         <w:t xml:space="preserve"> </w:t>
       </w:r>
       <w:r>
-        <w:t xml:space="preserve">A→B → 2) emits</w:t>
+        <w:t xml:space="preserve">A→B.</w:t>
+      </w:r>
+    </w:p>
+    <w:p>
+      <w:pPr>
+        <w:numPr>
+          <w:ilvl w:val="0"/>
+          <w:numId w:val="1003"/>
+        </w:numPr>
+        <w:pStyle w:val="Compact"/>
+      </w:pPr>
+      <w:r>
+        <w:t xml:space="preserve">Emits</w:t>
       </w:r>
       <w:r>
         <w:t xml:space="preserve"> </w:t>
@@ -634,9 +652,11 @@
       <w:r>
         <w:t xml:space="preserve">reacts.</w:t>
       </w:r>
-      <w:r>
-        <w:t xml:space="preserve"> </w:t>
-      </w:r>
+    </w:p>
+    <w:p>
+      <w:pPr>
+        <w:pStyle w:val="FirstParagraph"/>
+      </w:pPr>
       <w:r>
         <w:rPr>
           <w:bCs/>
@@ -703,7 +723,7 @@
               <a:graphicData uri="http://schemas.openxmlformats.org/drawingml/2006/picture">
                 <pic:pic>
                   <pic:nvPicPr>
-                    <pic:cNvPr descr="/tmp/docximg-dY8fbM/_TEMPLATE_md_1.png" id="23" name="Picture"/>
+                    <pic:cNvPr descr="/tmp/docximg-J7W2Aj/_TEMPLATE_md_1.png" id="23" name="Picture"/>
                     <pic:cNvPicPr>
                       <a:picLocks noChangeArrowheads="1" noChangeAspect="1"/>
                     </pic:cNvPicPr>
@@ -2573,7 +2593,7 @@
       <w:pPr>
         <w:numPr>
           <w:ilvl w:val="0"/>
-          <w:numId w:val="1003"/>
+          <w:numId w:val="1004"/>
         </w:numPr>
         <w:pStyle w:val="Compact"/>
       </w:pPr>
@@ -2610,65 +2630,6 @@
       </w:r>
       <w:r>
         <w:t xml:space="preserve">) — &lt;when / payload keys / who consumes&gt;</w:t>
-      </w:r>
-    </w:p>
-    <w:p>
-      <w:pPr>
-        <w:numPr>
-          <w:ilvl w:val="0"/>
-          <w:numId w:val="1003"/>
-        </w:numPr>
-        <w:pStyle w:val="Compact"/>
-      </w:pPr>
-      <w:r>
-        <w:rPr>
-          <w:bCs/>
-          <w:b/>
-        </w:rPr>
-        <w:t xml:space="preserve">Consumes:</w:t>
-      </w:r>
-      <w:r>
-        <w:t xml:space="preserve"> </w:t>
-      </w:r>
-      <w:r>
-        <w:rPr>
-          <w:rStyle w:val="VerbatimChar"/>
-        </w:rPr>
-        <w:t xml:space="preserve">&lt;EventType&gt;</w:t>
-      </w:r>
-      <w:r>
-        <w:t xml:space="preserve"> </w:t>
-      </w:r>
-      <w:r>
-        <w:t xml:space="preserve">via</w:t>
-      </w:r>
-      <w:r>
-        <w:t xml:space="preserve"> </w:t>
-      </w:r>
-      <w:r>
-        <w:rPr>
-          <w:rStyle w:val="VerbatimChar"/>
-        </w:rPr>
-        <w:t xml:space="preserve">&lt;Listener&gt;</w:t>
-      </w:r>
-      <w:r>
-        <w:t xml:space="preserve"> </w:t>
-      </w:r>
-      <w:r>
-        <w:t xml:space="preserve">—</w:t>
-      </w:r>
-      <w:r>
-        <w:t xml:space="preserve"> </w:t>
-      </w:r>
-    </w:p>
-    <w:bookmarkEnd w:id="31"/>
-    <w:bookmarkStart w:id="32" w:name="X5909db2aa868473524634132ee38a1b5a550c2c"/>
-    <w:p>
-      <w:pPr>
-        <w:pStyle w:val="Heading2"/>
-      </w:pPr>
-      <w:r>
-        <w:t xml:space="preserve">6. Processes (workflow) — with handler examples</w:t>
       </w:r>
     </w:p>
     <w:p>
@@ -2684,294 +2645,50 @@
           <w:bCs/>
           <w:b/>
         </w:rPr>
-        <w:t xml:space="preserve">Flows:</w:t>
-      </w:r>
-      <w:r>
-        <w:t xml:space="preserve"> </w:t>
-      </w:r>
-      <w:r>
-        <w:rPr>
-          <w:rStyle w:val="VerbatimChar"/>
-        </w:rPr>
-        <w:t xml:space="preserve">&lt;process key&gt;</w:t>
-      </w:r>
-      <w:r>
-        <w:t xml:space="preserve"> </w:t>
-      </w:r>
-      <w:r>
-        <w:t xml:space="preserve">— &lt;when triggered, terminal states&gt;</w:t>
-      </w:r>
-    </w:p>
-    <w:p>
-      <w:pPr>
-        <w:numPr>
-          <w:ilvl w:val="0"/>
-          <w:numId w:val="1004"/>
-        </w:numPr>
-        <w:pStyle w:val="Compact"/>
-      </w:pPr>
-      <w:r>
-        <w:rPr>
-          <w:bCs/>
-          <w:b/>
-        </w:rPr>
-        <w:t xml:space="preserve">Handlers (topics):</w:t>
-      </w:r>
-      <w:r>
-        <w:t xml:space="preserve"> </w:t>
-      </w:r>
-      <w:r>
-        <w:rPr>
-          <w:rStyle w:val="VerbatimChar"/>
-        </w:rPr>
-        <w:t xml:space="preserve">&lt;topic&gt;</w:t>
-      </w:r>
-      <w:r>
-        <w:t xml:space="preserve"> </w:t>
-      </w:r>
-      <w:r>
-        <w:t xml:space="preserve">→</w:t>
-      </w:r>
-      <w:r>
-        <w:t xml:space="preserve"> </w:t>
-      </w:r>
-      <w:r>
-        <w:rPr>
-          <w:rStyle w:val="VerbatimChar"/>
-        </w:rPr>
-        <w:t xml:space="preserve">&lt;Handler&gt;</w:t>
-      </w:r>
-      <w:r>
-        <w:t xml:space="preserve"> </w:t>
-      </w:r>
-      <w:r>
-        <w:t xml:space="preserve">— &lt;what the step does, outputs&gt;</w:t>
-      </w:r>
-    </w:p>
-    <w:p>
-      <w:pPr>
-        <w:numPr>
-          <w:ilvl w:val="0"/>
-          <w:numId w:val="1004"/>
-        </w:numPr>
-        <w:pStyle w:val="Compact"/>
-      </w:pPr>
-      <w:r>
-        <w:t xml:space="preserve">Trigger entrypoint:</w:t>
-      </w:r>
-      <w:r>
-        <w:t xml:space="preserve"> </w:t>
-      </w:r>
-      <w:r>
-        <w:rPr>
-          <w:rStyle w:val="VerbatimChar"/>
-        </w:rPr>
-        <w:t xml:space="preserve">&lt;Service::method&gt;</w:t>
-      </w:r>
-      <w:r>
-        <w:t xml:space="preserve">; reconciliation:</w:t>
-      </w:r>
-      <w:r>
-        <w:t xml:space="preserve"> </w:t>
-      </w:r>
-      <w:r>
-        <w:rPr>
-          <w:rStyle w:val="VerbatimChar"/>
-        </w:rPr>
-        <w:t xml:space="preserve">&lt;…&gt;</w:t>
-      </w:r>
-    </w:p>
-    <w:p>
-      <w:pPr>
-        <w:pStyle w:val="FirstParagraph"/>
-      </w:pPr>
-      <w:r>
-        <w:rPr>
-          <w:bCs/>
-          <w:b/>
-        </w:rPr>
-        <w:t xml:space="preserve">Worked handler —</w:t>
-      </w:r>
-      <w:r>
-        <w:rPr>
-          <w:bCs/>
-          <w:b/>
-        </w:rPr>
-        <w:t xml:space="preserve"> </w:t>
-      </w:r>
-      <w:r>
-        <w:rPr>
-          <w:rStyle w:val="VerbatimChar"/>
-          <w:bCs/>
-          <w:b/>
-        </w:rPr>
-        <w:t xml:space="preserve">&lt;Handler&gt;</w:t>
-      </w:r>
-      <w:r>
-        <w:rPr>
-          <w:bCs/>
-          <w:b/>
-        </w:rPr>
-        <w:t xml:space="preserve"> </w:t>
-      </w:r>
-      <w:r>
-        <w:rPr>
-          <w:bCs/>
-          <w:b/>
-        </w:rPr>
-        <w:t xml:space="preserve">(topic</w:t>
-      </w:r>
-      <w:r>
-        <w:rPr>
-          <w:bCs/>
-          <w:b/>
-        </w:rPr>
-        <w:t xml:space="preserve"> </w:t>
-      </w:r>
-      <w:r>
-        <w:rPr>
-          <w:rStyle w:val="VerbatimChar"/>
-          <w:bCs/>
-          <w:b/>
-        </w:rPr>
-        <w:t xml:space="preserve">&lt;topic&gt;</w:t>
-      </w:r>
-      <w:r>
-        <w:rPr>
-          <w:bCs/>
-          <w:b/>
-        </w:rPr>
-        <w:t xml:space="preserve">):</w:t>
-      </w:r>
-    </w:p>
-    <w:p>
-      <w:pPr>
-        <w:pStyle w:val="BlockText"/>
-      </w:pPr>
-      <w:r>
-        <w:t xml:space="preserve">Invoked by the worker when the flow reaches the</w:t>
-      </w:r>
-      <w:r>
-        <w:t xml:space="preserve"> </w:t>
-      </w:r>
-      <w:r>
-        <w:rPr>
-          <w:rStyle w:val="VerbatimChar"/>
-        </w:rPr>
-        <w:t xml:space="preserve">&lt;node&gt;</w:t>
-      </w:r>
-      <w:r>
-        <w:t xml:space="preserve"> </w:t>
-      </w:r>
-      <w:r>
-        <w:t xml:space="preserve">node.</w:t>
-      </w:r>
-      <w:r>
-        <w:t xml:space="preserve"> </w:t>
-      </w:r>
-      <w:r>
-        <w:rPr>
-          <w:bCs/>
-          <w:b/>
-        </w:rPr>
-        <w:t xml:space="preserve">Reads vars:</w:t>
-      </w:r>
-      <w:r>
-        <w:t xml:space="preserve"> </w:t>
-      </w:r>
-      <w:r>
-        <w:rPr>
-          <w:rStyle w:val="VerbatimChar"/>
-        </w:rPr>
-        <w:t xml:space="preserve">{subscriptionId, …}</w:t>
-      </w:r>
-      <w:r>
-        <w:t xml:space="preserve"> </w:t>
-      </w:r>
-      <w:r>
-        <w:t xml:space="preserve">·</w:t>
-      </w:r>
-      <w:r>
-        <w:t xml:space="preserve"> </w:t>
-      </w:r>
-      <w:r>
-        <w:rPr>
-          <w:bCs/>
-          <w:b/>
-        </w:rPr>
-        <w:t xml:space="preserve">Does:</w:t>
-      </w:r>
-      <w:r>
-        <w:t xml:space="preserve"> </w:t>
-      </w:r>
-      <w:r>
-        <w:t xml:space="preserve">&lt;…&gt; ·</w:t>
-      </w:r>
-      <w:r>
-        <w:t xml:space="preserve"> </w:t>
-      </w:r>
-      <w:r>
-        <w:rPr>
-          <w:bCs/>
-          <w:b/>
-        </w:rPr>
-        <w:t xml:space="preserve">Outputs:</w:t>
-      </w:r>
-      <w:r>
-        <w:t xml:space="preserve"> </w:t>
-      </w:r>
-      <w:r>
-        <w:rPr>
-          <w:rStyle w:val="VerbatimChar"/>
-        </w:rPr>
-        <w:t xml:space="preserve">{&lt;key&gt;:&lt;val&gt;}</w:t>
-      </w:r>
-      <w:r>
-        <w:t xml:space="preserve"> </w:t>
-      </w:r>
-      <w:r>
-        <w:t xml:space="preserve">(drives the</w:t>
-      </w:r>
-      <w:r>
-        <w:t xml:space="preserve"> </w:t>
-      </w:r>
-      <w:r>
-        <w:t xml:space="preserve">next gateway) ·</w:t>
-      </w:r>
-      <w:r>
-        <w:t xml:space="preserve"> </w:t>
-      </w:r>
-      <w:r>
-        <w:rPr>
-          <w:bCs/>
-          <w:b/>
-        </w:rPr>
-        <w:t xml:space="preserve">On fail:</w:t>
-      </w:r>
-      <w:r>
-        <w:t xml:space="preserve"> </w:t>
-      </w:r>
-      <w:r>
-        <w:rPr>
-          <w:rStyle w:val="VerbatimChar"/>
-        </w:rPr>
-        <w:t xml:space="preserve">TaskResult::fail(...)</w:t>
-      </w:r>
-      <w:r>
-        <w:t xml:space="preserve"> </w:t>
-      </w:r>
-      <w:r>
-        <w:t xml:space="preserve">(retryable? &lt;y/n&gt;).</w:t>
-      </w:r>
-    </w:p>
-    <w:bookmarkEnd w:id="32"/>
-    <w:bookmarkStart w:id="33" w:name="Xe5bd77eb5760fdeee6485feae20b10260cfbb5d"/>
+        <w:t xml:space="preserve">Consumes:</w:t>
+      </w:r>
+      <w:r>
+        <w:t xml:space="preserve"> </w:t>
+      </w:r>
+      <w:r>
+        <w:rPr>
+          <w:rStyle w:val="VerbatimChar"/>
+        </w:rPr>
+        <w:t xml:space="preserve">&lt;EventType&gt;</w:t>
+      </w:r>
+      <w:r>
+        <w:t xml:space="preserve"> </w:t>
+      </w:r>
+      <w:r>
+        <w:t xml:space="preserve">via</w:t>
+      </w:r>
+      <w:r>
+        <w:t xml:space="preserve"> </w:t>
+      </w:r>
+      <w:r>
+        <w:rPr>
+          <w:rStyle w:val="VerbatimChar"/>
+        </w:rPr>
+        <w:t xml:space="preserve">&lt;Listener&gt;</w:t>
+      </w:r>
+      <w:r>
+        <w:t xml:space="preserve"> </w:t>
+      </w:r>
+      <w:r>
+        <w:t xml:space="preserve">—</w:t>
+      </w:r>
+      <w:r>
+        <w:t xml:space="preserve"> </w:t>
+      </w:r>
+    </w:p>
+    <w:bookmarkEnd w:id="31"/>
+    <w:bookmarkStart w:id="32" w:name="X5909db2aa868473524634132ee38a1b5a550c2c"/>
     <w:p>
       <w:pPr>
         <w:pStyle w:val="Heading2"/>
       </w:pPr>
       <w:r>
-        <w:t xml:space="preserve">7. Policy &amp; config (no-code knobs)</w:t>
+        <w:t xml:space="preserve">6. Processes (workflow) — with handler examples</w:t>
       </w:r>
     </w:p>
     <w:p>
@@ -2987,22 +2704,22 @@
           <w:bCs/>
           <w:b/>
         </w:rPr>
-        <w:t xml:space="preserve">Rules packages:</w:t>
-      </w:r>
-      <w:r>
-        <w:t xml:space="preserve"> </w:t>
-      </w:r>
-      <w:r>
-        <w:rPr>
-          <w:rStyle w:val="VerbatimChar"/>
-        </w:rPr>
-        <w:t xml:space="preserve">&lt;rules.xxx&gt;</w:t>
-      </w:r>
-      <w:r>
-        <w:t xml:space="preserve"> </w:t>
-      </w:r>
-      <w:r>
-        <w:t xml:space="preserve">— &lt;inputs → outputs, fallback&gt;</w:t>
+        <w:t xml:space="preserve">Flows:</w:t>
+      </w:r>
+      <w:r>
+        <w:t xml:space="preserve"> </w:t>
+      </w:r>
+      <w:r>
+        <w:rPr>
+          <w:rStyle w:val="VerbatimChar"/>
+        </w:rPr>
+        <w:t xml:space="preserve">&lt;process key&gt;</w:t>
+      </w:r>
+      <w:r>
+        <w:t xml:space="preserve"> </w:t>
+      </w:r>
+      <w:r>
+        <w:t xml:space="preserve">— &lt;when triggered, terminal states&gt;</w:t>
       </w:r>
     </w:p>
     <w:p>
@@ -3018,35 +2735,263 @@
           <w:bCs/>
           <w:b/>
         </w:rPr>
-        <w:t xml:space="preserve">Catalogs / config tables:</w:t>
-      </w:r>
-      <w:r>
-        <w:t xml:space="preserve"> </w:t>
-      </w:r>
-      <w:r>
-        <w:rPr>
-          <w:rStyle w:val="VerbatimChar"/>
-        </w:rPr>
-        <w:t xml:space="preserve">&lt;table&gt;</w:t>
-      </w:r>
-      <w:r>
-        <w:t xml:space="preserve"> </w:t>
-      </w:r>
-      <w:r>
-        <w:t xml:space="preserve">—</w:t>
-      </w:r>
-      <w:r>
-        <w:t xml:space="preserve"> </w:t>
-      </w:r>
-    </w:p>
-    <w:bookmarkEnd w:id="33"/>
-    <w:bookmarkStart w:id="34" w:name="X63a8d27571a07c76bbbdc15cf677d35be107ee2"/>
+        <w:t xml:space="preserve">Handlers (topics):</w:t>
+      </w:r>
+      <w:r>
+        <w:t xml:space="preserve"> </w:t>
+      </w:r>
+      <w:r>
+        <w:rPr>
+          <w:rStyle w:val="VerbatimChar"/>
+        </w:rPr>
+        <w:t xml:space="preserve">&lt;topic&gt;</w:t>
+      </w:r>
+      <w:r>
+        <w:t xml:space="preserve"> </w:t>
+      </w:r>
+      <w:r>
+        <w:t xml:space="preserve">→</w:t>
+      </w:r>
+      <w:r>
+        <w:t xml:space="preserve"> </w:t>
+      </w:r>
+      <w:r>
+        <w:rPr>
+          <w:rStyle w:val="VerbatimChar"/>
+        </w:rPr>
+        <w:t xml:space="preserve">&lt;Handler&gt;</w:t>
+      </w:r>
+      <w:r>
+        <w:t xml:space="preserve"> </w:t>
+      </w:r>
+      <w:r>
+        <w:t xml:space="preserve">— &lt;what the step does, outputs&gt;</w:t>
+      </w:r>
+    </w:p>
+    <w:p>
+      <w:pPr>
+        <w:numPr>
+          <w:ilvl w:val="0"/>
+          <w:numId w:val="1005"/>
+        </w:numPr>
+        <w:pStyle w:val="Compact"/>
+      </w:pPr>
+      <w:r>
+        <w:t xml:space="preserve">Trigger entrypoint:</w:t>
+      </w:r>
+      <w:r>
+        <w:t xml:space="preserve"> </w:t>
+      </w:r>
+      <w:r>
+        <w:rPr>
+          <w:rStyle w:val="VerbatimChar"/>
+        </w:rPr>
+        <w:t xml:space="preserve">&lt;Service::method&gt;</w:t>
+      </w:r>
+      <w:r>
+        <w:t xml:space="preserve">; reconciliation:</w:t>
+      </w:r>
+      <w:r>
+        <w:t xml:space="preserve"> </w:t>
+      </w:r>
+      <w:r>
+        <w:rPr>
+          <w:rStyle w:val="VerbatimChar"/>
+        </w:rPr>
+        <w:t xml:space="preserve">&lt;…&gt;</w:t>
+      </w:r>
+    </w:p>
+    <w:p>
+      <w:pPr>
+        <w:pStyle w:val="FirstParagraph"/>
+      </w:pPr>
+      <w:r>
+        <w:rPr>
+          <w:bCs/>
+          <w:b/>
+        </w:rPr>
+        <w:t xml:space="preserve">Worked handler —</w:t>
+      </w:r>
+      <w:r>
+        <w:rPr>
+          <w:bCs/>
+          <w:b/>
+        </w:rPr>
+        <w:t xml:space="preserve"> </w:t>
+      </w:r>
+      <w:r>
+        <w:rPr>
+          <w:rStyle w:val="VerbatimChar"/>
+          <w:bCs/>
+          <w:b/>
+        </w:rPr>
+        <w:t xml:space="preserve">&lt;Handler&gt;</w:t>
+      </w:r>
+      <w:r>
+        <w:rPr>
+          <w:bCs/>
+          <w:b/>
+        </w:rPr>
+        <w:t xml:space="preserve"> </w:t>
+      </w:r>
+      <w:r>
+        <w:rPr>
+          <w:bCs/>
+          <w:b/>
+        </w:rPr>
+        <w:t xml:space="preserve">(topic</w:t>
+      </w:r>
+      <w:r>
+        <w:rPr>
+          <w:bCs/>
+          <w:b/>
+        </w:rPr>
+        <w:t xml:space="preserve"> </w:t>
+      </w:r>
+      <w:r>
+        <w:rPr>
+          <w:rStyle w:val="VerbatimChar"/>
+          <w:bCs/>
+          <w:b/>
+        </w:rPr>
+        <w:t xml:space="preserve">&lt;topic&gt;</w:t>
+      </w:r>
+      <w:r>
+        <w:rPr>
+          <w:bCs/>
+          <w:b/>
+        </w:rPr>
+        <w:t xml:space="preserve">):</w:t>
+      </w:r>
+    </w:p>
+    <w:p>
+      <w:pPr>
+        <w:pStyle w:val="BlockText"/>
+      </w:pPr>
+      <w:r>
+        <w:t xml:space="preserve">Invoked by the worker when the flow reaches the</w:t>
+      </w:r>
+      <w:r>
+        <w:t xml:space="preserve"> </w:t>
+      </w:r>
+      <w:r>
+        <w:rPr>
+          <w:rStyle w:val="VerbatimChar"/>
+        </w:rPr>
+        <w:t xml:space="preserve">&lt;node&gt;</w:t>
+      </w:r>
+      <w:r>
+        <w:t xml:space="preserve"> </w:t>
+      </w:r>
+      <w:r>
+        <w:t xml:space="preserve">node.</w:t>
+      </w:r>
+      <w:r>
+        <w:t xml:space="preserve"> </w:t>
+      </w:r>
+      <w:r>
+        <w:rPr>
+          <w:bCs/>
+          <w:b/>
+        </w:rPr>
+        <w:t xml:space="preserve">Reads vars:</w:t>
+      </w:r>
+      <w:r>
+        <w:t xml:space="preserve"> </w:t>
+      </w:r>
+      <w:r>
+        <w:rPr>
+          <w:rStyle w:val="VerbatimChar"/>
+        </w:rPr>
+        <w:t xml:space="preserve">{subscriptionId, …}</w:t>
+      </w:r>
+      <w:r>
+        <w:t xml:space="preserve"> </w:t>
+      </w:r>
+      <w:r>
+        <w:t xml:space="preserve">·</w:t>
+      </w:r>
+      <w:r>
+        <w:t xml:space="preserve"> </w:t>
+      </w:r>
+      <w:r>
+        <w:rPr>
+          <w:bCs/>
+          <w:b/>
+        </w:rPr>
+        <w:t xml:space="preserve">Does:</w:t>
+      </w:r>
+      <w:r>
+        <w:t xml:space="preserve"> </w:t>
+      </w:r>
+      <w:r>
+        <w:t xml:space="preserve">&lt;…&gt; ·</w:t>
+      </w:r>
+      <w:r>
+        <w:t xml:space="preserve"> </w:t>
+      </w:r>
+      <w:r>
+        <w:rPr>
+          <w:bCs/>
+          <w:b/>
+        </w:rPr>
+        <w:t xml:space="preserve">Outputs:</w:t>
+      </w:r>
+      <w:r>
+        <w:t xml:space="preserve"> </w:t>
+      </w:r>
+      <w:r>
+        <w:rPr>
+          <w:rStyle w:val="VerbatimChar"/>
+        </w:rPr>
+        <w:t xml:space="preserve">{&lt;key&gt;:&lt;val&gt;}</w:t>
+      </w:r>
+      <w:r>
+        <w:t xml:space="preserve"> </w:t>
+      </w:r>
+      <w:r>
+        <w:t xml:space="preserve">(drives the</w:t>
+      </w:r>
+      <w:r>
+        <w:t xml:space="preserve"> </w:t>
+      </w:r>
+      <w:r>
+        <w:t xml:space="preserve">next gateway) ·</w:t>
+      </w:r>
+      <w:r>
+        <w:t xml:space="preserve"> </w:t>
+      </w:r>
+      <w:r>
+        <w:rPr>
+          <w:bCs/>
+          <w:b/>
+        </w:rPr>
+        <w:t xml:space="preserve">On fail:</w:t>
+      </w:r>
+      <w:r>
+        <w:t xml:space="preserve"> </w:t>
+      </w:r>
+      <w:r>
+        <w:rPr>
+          <w:rStyle w:val="VerbatimChar"/>
+        </w:rPr>
+        <w:t xml:space="preserve">TaskResult::fail(...)</w:t>
+      </w:r>
+      <w:r>
+        <w:t xml:space="preserve"> </w:t>
+      </w:r>
+      <w:r>
+        <w:t xml:space="preserve">(retryable? &lt;y/n&gt;).</w:t>
+      </w:r>
+    </w:p>
+    <w:bookmarkEnd w:id="32"/>
+    <w:bookmarkStart w:id="33" w:name="Xe5bd77eb5760fdeee6485feae20b10260cfbb5d"/>
     <w:p>
       <w:pPr>
         <w:pStyle w:val="Heading2"/>
       </w:pPr>
       <w:r>
-        <w:t xml:space="preserve">8. Cross-module dependencies</w:t>
+        <w:t xml:space="preserve">7. Policy &amp; config (no-code knobs)</w:t>
       </w:r>
     </w:p>
     <w:p>
@@ -3058,31 +3003,26 @@
         <w:pStyle w:val="Compact"/>
       </w:pPr>
       <w:r>
-        <w:t xml:space="preserve">Calls →</w:t>
-      </w:r>
-      <w:r>
-        <w:t xml:space="preserve"> </w:t>
-      </w:r>
-      <w:r>
-        <w:rPr>
-          <w:rStyle w:val="VerbatimChar"/>
-        </w:rPr>
-        <w:t xml:space="preserve">&lt;Module::Service&gt;</w:t>
-      </w:r>
-      <w:r>
-        <w:t xml:space="preserve"> </w:t>
-      </w:r>
-      <w:r>
-        <w:t xml:space="preserve">for</w:t>
-      </w:r>
-      <w:r>
-        <w:t xml:space="preserve"> </w:t>
-      </w:r>
-      <w:r>
-        <w:rPr>
-          <w:rStyle w:val="VerbatimChar"/>
-        </w:rPr>
-        <w:t xml:space="preserve">&lt;purpose&gt;</w:t>
+        <w:rPr>
+          <w:bCs/>
+          <w:b/>
+        </w:rPr>
+        <w:t xml:space="preserve">Rules packages:</w:t>
+      </w:r>
+      <w:r>
+        <w:t xml:space="preserve"> </w:t>
+      </w:r>
+      <w:r>
+        <w:rPr>
+          <w:rStyle w:val="VerbatimChar"/>
+        </w:rPr>
+        <w:t xml:space="preserve">&lt;rules.xxx&gt;</w:t>
+      </w:r>
+      <w:r>
+        <w:t xml:space="preserve"> </w:t>
+      </w:r>
+      <w:r>
+        <w:t xml:space="preserve">— &lt;inputs → outputs, fallback&gt;</w:t>
       </w:r>
     </w:p>
     <w:p>
@@ -3090,6 +3030,86 @@
         <w:numPr>
           <w:ilvl w:val="0"/>
           <w:numId w:val="1006"/>
+        </w:numPr>
+        <w:pStyle w:val="Compact"/>
+      </w:pPr>
+      <w:r>
+        <w:rPr>
+          <w:bCs/>
+          <w:b/>
+        </w:rPr>
+        <w:t xml:space="preserve">Catalogs / config tables:</w:t>
+      </w:r>
+      <w:r>
+        <w:t xml:space="preserve"> </w:t>
+      </w:r>
+      <w:r>
+        <w:rPr>
+          <w:rStyle w:val="VerbatimChar"/>
+        </w:rPr>
+        <w:t xml:space="preserve">&lt;table&gt;</w:t>
+      </w:r>
+      <w:r>
+        <w:t xml:space="preserve"> </w:t>
+      </w:r>
+      <w:r>
+        <w:t xml:space="preserve">—</w:t>
+      </w:r>
+      <w:r>
+        <w:t xml:space="preserve"> </w:t>
+      </w:r>
+    </w:p>
+    <w:bookmarkEnd w:id="33"/>
+    <w:bookmarkStart w:id="34" w:name="X63a8d27571a07c76bbbdc15cf677d35be107ee2"/>
+    <w:p>
+      <w:pPr>
+        <w:pStyle w:val="Heading2"/>
+      </w:pPr>
+      <w:r>
+        <w:t xml:space="preserve">8. Cross-module dependencies</w:t>
+      </w:r>
+    </w:p>
+    <w:p>
+      <w:pPr>
+        <w:numPr>
+          <w:ilvl w:val="0"/>
+          <w:numId w:val="1007"/>
+        </w:numPr>
+        <w:pStyle w:val="Compact"/>
+      </w:pPr>
+      <w:r>
+        <w:t xml:space="preserve">Calls →</w:t>
+      </w:r>
+      <w:r>
+        <w:t xml:space="preserve"> </w:t>
+      </w:r>
+      <w:r>
+        <w:rPr>
+          <w:rStyle w:val="VerbatimChar"/>
+        </w:rPr>
+        <w:t xml:space="preserve">&lt;Module::Service&gt;</w:t>
+      </w:r>
+      <w:r>
+        <w:t xml:space="preserve"> </w:t>
+      </w:r>
+      <w:r>
+        <w:t xml:space="preserve">for</w:t>
+      </w:r>
+      <w:r>
+        <w:t xml:space="preserve"> </w:t>
+      </w:r>
+      <w:r>
+        <w:rPr>
+          <w:rStyle w:val="VerbatimChar"/>
+        </w:rPr>
+        <w:t xml:space="preserve">&lt;purpose&gt;</w:t>
+      </w:r>
+    </w:p>
+    <w:p>
+      <w:pPr>
+        <w:numPr>
+          <w:ilvl w:val="0"/>
+          <w:numId w:val="1007"/>
         </w:numPr>
         <w:pStyle w:val="Compact"/>
       </w:pPr>
@@ -3280,7 +3300,7 @@
       <w:pPr>
         <w:numPr>
           <w:ilvl w:val="0"/>
-          <w:numId w:val="1007"/>
+          <w:numId w:val="1008"/>
         </w:numPr>
         <w:pStyle w:val="Compact"/>
       </w:pPr>
@@ -3292,7 +3312,7 @@
       <w:pPr>
         <w:numPr>
           <w:ilvl w:val="0"/>
-          <w:numId w:val="1007"/>
+          <w:numId w:val="1008"/>
         </w:numPr>
         <w:pStyle w:val="Compact"/>
       </w:pPr>
@@ -3484,6 +3504,91 @@
       </w:pPr>
     </w:lvl>
   </w:abstractNum>
+  <w:abstractNum w:abstractNumId="99411">
+    <w:nsid w:val="A99411"/>
+    <w:multiLevelType w:val="multilevel"/>
+    <w:lvl w:ilvl="0">
+      <w:start w:val="1"/>
+      <w:numFmt w:val="decimal"/>
+      <w:lvlText w:val="%1."/>
+      <w:lvlJc w:val="left"/>
+      <w:pPr>
+        <w:ind w:left="720" w:hanging="480"/>
+      </w:pPr>
+    </w:lvl>
+    <w:lvl w:ilvl="1">
+      <w:start w:val="1"/>
+      <w:numFmt w:val="decimal"/>
+      <w:lvlText w:val="%2."/>
+      <w:lvlJc w:val="left"/>
+      <w:pPr>
+        <w:ind w:left="1440" w:hanging="480"/>
+      </w:pPr>
+    </w:lvl>
+    <w:lvl w:ilvl="2">
+      <w:start w:val="1"/>
+      <w:numFmt w:val="decimal"/>
+      <w:lvlText w:val="%3."/>
+      <w:lvlJc w:val="left"/>
+      <w:pPr>
+        <w:ind w:left="2160" w:hanging="480"/>
+      </w:pPr>
+    </w:lvl>
+    <w:lvl w:ilvl="3">
+      <w:start w:val="1"/>
+      <w:numFmt w:val="decimal"/>
+      <w:lvlText w:val="%4."/>
+      <w:lvlJc w:val="left"/>
+      <w:pPr>
+        <w:ind w:left="2880" w:hanging="480"/>
+      </w:pPr>
+    </w:lvl>
+    <w:lvl w:ilvl="4">
+      <w:start w:val="1"/>
+      <w:numFmt w:val="decimal"/>
+      <w:lvlText w:val="%5."/>
+      <w:lvlJc w:val="left"/>
+      <w:pPr>
+        <w:ind w:left="3600" w:hanging="480"/>
+      </w:pPr>
+    </w:lvl>
+    <w:lvl w:ilvl="5">
+      <w:start w:val="1"/>
+      <w:numFmt w:val="decimal"/>
+      <w:lvlText w:val="%6."/>
+      <w:lvlJc w:val="left"/>
+      <w:pPr>
+        <w:ind w:left="4320" w:hanging="480"/>
+      </w:pPr>
+    </w:lvl>
+    <w:lvl w:ilvl="6">
+      <w:start w:val="1"/>
+      <w:numFmt w:val="decimal"/>
+      <w:lvlText w:val="%7."/>
+      <w:lvlJc w:val="left"/>
+      <w:pPr>
+        <w:ind w:left="5040" w:hanging="480"/>
+      </w:pPr>
+    </w:lvl>
+    <w:lvl w:ilvl="7">
+      <w:start w:val="1"/>
+      <w:numFmt w:val="decimal"/>
+      <w:lvlText w:val="%8."/>
+      <w:lvlJc w:val="left"/>
+      <w:pPr>
+        <w:ind w:left="5760" w:hanging="480"/>
+      </w:pPr>
+    </w:lvl>
+    <w:lvl w:ilvl="8">
+      <w:start w:val="1"/>
+      <w:numFmt w:val="decimal"/>
+      <w:lvlText w:val="%9."/>
+      <w:lvlJc w:val="left"/>
+      <w:pPr>
+        <w:ind w:left="6480" w:hanging="480"/>
+      </w:pPr>
+    </w:lvl>
+  </w:abstractNum>
   <w:num w:numId="1000">
     <w:abstractNumId w:val="990"/>
   </w:num>
@@ -3494,7 +3599,34 @@
     <w:abstractNumId w:val="991"/>
   </w:num>
   <w:num w:numId="1003">
-    <w:abstractNumId w:val="991"/>
+    <w:abstractNumId w:val="99411"/>
+    <w:lvlOverride w:ilvl="0">
+      <w:startOverride w:val="1"/>
+    </w:lvlOverride>
+    <w:lvlOverride w:ilvl="1">
+      <w:startOverride w:val="1"/>
+    </w:lvlOverride>
+    <w:lvlOverride w:ilvl="2">
+      <w:startOverride w:val="1"/>
+    </w:lvlOverride>
+    <w:lvlOverride w:ilvl="3">
+      <w:startOverride w:val="1"/>
+    </w:lvlOverride>
+    <w:lvlOverride w:ilvl="4">
+      <w:startOverride w:val="1"/>
+    </w:lvlOverride>
+    <w:lvlOverride w:ilvl="5">
+      <w:startOverride w:val="1"/>
+    </w:lvlOverride>
+    <w:lvlOverride w:ilvl="6">
+      <w:startOverride w:val="1"/>
+    </w:lvlOverride>
+    <w:lvlOverride w:ilvl="7">
+      <w:startOverride w:val="1"/>
+    </w:lvlOverride>
+    <w:lvlOverride w:ilvl="8">
+      <w:startOverride w:val="1"/>
+    </w:lvlOverride>
   </w:num>
   <w:num w:numId="1004">
     <w:abstractNumId w:val="991"/>
@@ -3506,6 +3638,9 @@
     <w:abstractNumId w:val="991"/>
   </w:num>
   <w:num w:numId="1007">
+    <w:abstractNumId w:val="991"/>
+  </w:num>
+  <w:num w:numId="1008">
     <w:abstractNumId w:val="991"/>
   </w:num>
 </w:numbering>

</xml_diff>